<commit_message>
Update chapter title and author details in YAML configuration for consistency
</commit_message>
<xml_diff>
--- a/_output/SATP-Methodology.docx
+++ b/_output/SATP-Methodology.docx
@@ -7,7 +7,7 @@
         <w:pStyle w:val="Title"/>
       </w:pPr>
       <w:r>
-        <w:t xml:space="preserve">Chapter 4 - Procedure for testing and adjusting translations of the Soundscape (quasi-)Circumplex Model</w:t>
+        <w:t xml:space="preserve">Chapter 4 - Soundscape Translation Data: Analysis, Validation, and Application</w:t>
       </w:r>
     </w:p>
     <w:p>
@@ -23,7 +23,31 @@
         <w:pStyle w:val="Author"/>
       </w:pPr>
       <w:r>
+        <w:t xml:space="preserve">Tin Oberman</w:t>
+      </w:r>
+    </w:p>
+    <w:p>
+      <w:pPr>
+        <w:pStyle w:val="Author"/>
+      </w:pPr>
+      <w:r>
         <w:t xml:space="preserve">Francesco Aletta</w:t>
+      </w:r>
+    </w:p>
+    <w:p>
+      <w:pPr>
+        <w:pStyle w:val="Author"/>
+      </w:pPr>
+      <w:r>
+        <w:t xml:space="preserve">Jian Kang</w:t>
+      </w:r>
+    </w:p>
+    <w:p>
+      <w:pPr>
+        <w:pStyle w:val="Author"/>
+      </w:pPr>
+      <w:r>
+        <w:t xml:space="preserve">Östen Axelsson</w:t>
       </w:r>
     </w:p>
     <w:p>

</xml_diff>

<commit_message>
Fix text, remove duplicate footnote, embed HTML resources, disable Hypothesis
</commit_message>
<xml_diff>
--- a/_output/SATP-Methodology.docx
+++ b/_output/SATP-Methodology.docx
@@ -140,7 +140,7 @@
         <w:t xml:space="preserve"> </w:t>
       </w:r>
       <w:r>
-        <w:t xml:space="preserve">However, to ensure consistency and comparability across all twenty-two languages included in the Soundscape Attributes Translation Project (SATP), it was necessary to develop a standardised quantitative procedure which can evaluate all languages on the same basis and consider the compiled dataset as a whole.</w:t>
+        <w:t xml:space="preserve">However, to ensure consistency and comparability across all twenty-three languages included in the Soundscape Attributes Translation Project (SATP), it was necessary to develop a standardised quantitative procedure which can evaluate all languages on the same basis and consider the compiled dataset as a whole.</w:t>
       </w:r>
     </w:p>
     <w:p>
@@ -148,7 +148,7 @@
         <w:pStyle w:val="BodyText"/>
       </w:pPr>
       <w:r>
-        <w:t xml:space="preserve">This chapter therefore presents such a procedure: a systematic, four-step approach for evaluating and adjusting the quasi-circumplex structure of translated versions of the SCM questionnaire.</w:t>
+        <w:t xml:space="preserve">This chapter therefore presents such a procedure: a systematic, four-step approach for evaluating and adjusting the quasi-circumplex structure of translated versions of the SCM questionnaire. The outcome of this procedure is a classification of each translation’s structural validity and a set of adjusted angles that can be applied to correct for structural deviations when computing soundscape coordinates.</w:t>
       </w:r>
       <w:r>
         <w:t xml:space="preserve"> </w:t>
@@ -242,7 +242,7 @@
         <w:t xml:space="preserve"> </w:t>
       </w:r>
       <w:r>
-        <w:t xml:space="preserve">This chapter focuses exclusively on the quantitative validation procedure applied to the compiled SATP v1.5 dataset, which encompasses 23 languages collected across 24 institutions.</w:t>
+        <w:t xml:space="preserve">This chapter focuses exclusively on the quantitative validation procedure applied to the compiled SATP v1.5 dataset, which encompasses twenty-three languages collected across 24 institutions.</w:t>
       </w:r>
     </w:p>
     <w:p>
@@ -1777,13 +1777,7 @@
         <w:pStyle w:val="BodyText"/>
       </w:pPr>
       <w:r>
-        <w:t xml:space="preserve">Browne</w:t>
-      </w:r>
-      <w:r>
-        <w:t xml:space="preserve"> </w:t>
-      </w:r>
-      <w:r>
-        <w:t xml:space="preserve">(1992)</w:t>
+        <w:t xml:space="preserve">Browne (1992)</w:t>
       </w:r>
       <w:r>
         <w:t xml:space="preserve"> </w:t>
@@ -1853,7 +1847,7 @@
         <w:pStyle w:val="BodyText"/>
       </w:pPr>
       <w:r>
-        <w:t xml:space="preserve">As researchers delve into the intricacies of psychological spaces, the choice between a strict circumplex, a quasi-circumplex, or a more general circular structure becomes crucial.</w:t>
+        <w:t xml:space="preserve">As researchers encounter the intricacies of psychological spaces, the choice between a strict circumplex, a quasi-circumplex, or a more general circular structure becomes crucial.</w:t>
       </w:r>
       <w:r>
         <w:t xml:space="preserve"> </w:t>

</xml_diff>